<commit_message>
Fluency Lab worksheets, Modules 1 and 6: fewer words; Integers negatives in brackets
Co-Authored-By: Claude Opus 5.5 <noreply@anthropic.com>
Claude-Session: https://claude.ai/code/session_014YTiyifGRnSLg5sxKHwHzH
</commit_message>
<xml_diff>
--- a/grade8/Fluency-Lab-Package/module-materials/Module-1-Add-Subtract/FluencyLab_M1_Add_Guided.docx
+++ b/grade8/Fluency-Lab-Package/module-materials/Module-1-Add-Subtract/FluencyLab_M1_Add_Guided.docx
@@ -49,6 +49,9 @@
         <w:gridCol w:w="5960"/>
       </w:tblGrid>
       <w:tr>
+        <w:trPr>
+          <w:cantSplit/>
+        </w:trPr>
         <w:tc>
           <w:tcPr>
             <w:tcW w:type="dxa" w:w="3400"/>
@@ -136,7 +139,7 @@
           <w:sz w:val="26"/>
           <w:szCs w:val="26"/>
         </w:rPr>
-        <w:t xml:space="preserve">Refresher — how the algorithm works</w:t>
+        <w:t xml:space="preserve">Refresher</w:t>
       </w:r>
     </w:p>
     <w:tbl>
@@ -155,6 +158,9 @@
         <w:gridCol w:w="9360"/>
       </w:tblGrid>
       <w:tr>
+        <w:trPr>
+          <w:cantSplit/>
+        </w:trPr>
         <w:tc>
           <w:tcPr>
             <w:tcW w:type="dxa" w:w="9360"/>
@@ -254,7 +260,7 @@
           <w:sz w:val="22"/>
           <w:szCs w:val="22"/>
         </w:rPr>
-        <w:t xml:space="preserve">Stack the numbers so </w:t>
+        <w:t xml:space="preserve">Line up </w:t>
       </w:r>
       <w:r>
         <w:rPr>
@@ -264,7 +270,7 @@
           <w:sz w:val="22"/>
           <w:szCs w:val="22"/>
         </w:rPr>
-        <w:t xml:space="preserve">ones line up under ones</w:t>
+        <w:t xml:space="preserve">ones under ones</w:t>
       </w:r>
       <w:r>
         <w:rPr>
@@ -272,7 +278,7 @@
           <w:sz w:val="22"/>
           <w:szCs w:val="22"/>
         </w:rPr>
-        <w:t xml:space="preserve">, tens under tens.</w:t>
+        <w:t xml:space="preserve">.</w:t>
       </w:r>
     </w:p>
     <w:p>
@@ -290,7 +296,7 @@
           <w:sz w:val="22"/>
           <w:szCs w:val="22"/>
         </w:rPr>
-        <w:t xml:space="preserve">Add the ones: 7 + 8 = 15. Write the </w:t>
+        <w:t xml:space="preserve">Ones: 7 + 8 = 15. Write </w:t>
       </w:r>
       <w:r>
         <w:rPr>
@@ -308,7 +314,7 @@
           <w:sz w:val="22"/>
           <w:szCs w:val="22"/>
         </w:rPr>
-        <w:t xml:space="preserve">, carry the </w:t>
+        <w:t xml:space="preserve">, carry </w:t>
       </w:r>
       <w:r>
         <w:rPr>
@@ -326,7 +332,7 @@
           <w:sz w:val="22"/>
           <w:szCs w:val="22"/>
         </w:rPr>
-        <w:t xml:space="preserve"> above the tens.</w:t>
+        <w:t xml:space="preserve">.</w:t>
       </w:r>
     </w:p>
     <w:p>
@@ -344,7 +350,7 @@
           <w:sz w:val="22"/>
           <w:szCs w:val="22"/>
         </w:rPr>
-        <w:t xml:space="preserve">Add the tens: 1 + 4 + 3 = 8. Read the answer: </w:t>
+        <w:t xml:space="preserve">Tens: 1 + 4 + 3 = 8. Answer: </w:t>
       </w:r>
       <w:r>
         <w:rPr>
@@ -375,7 +381,7 @@
           <w:sz w:val="22"/>
           <w:szCs w:val="22"/>
         </w:rPr>
-        <w:t xml:space="preserve">Always work </w:t>
+        <w:t xml:space="preserve">Work </w:t>
       </w:r>
       <w:r>
         <w:rPr>
@@ -393,7 +399,7 @@
           <w:sz w:val="22"/>
           <w:szCs w:val="22"/>
         </w:rPr>
-        <w:t xml:space="preserve">. When a column reaches 10, carry.</w:t>
+        <w:t xml:space="preserve">. 10 or more? Carry 1.</w:t>
       </w:r>
     </w:p>
     <w:p>
@@ -409,11 +415,12 @@
           <w:sz w:val="26"/>
           <w:szCs w:val="26"/>
         </w:rPr>
-        <w:t xml:space="preserve">Guided practice — fill in each step</w:t>
+        <w:t xml:space="preserve">Your turn</w:t>
       </w:r>
     </w:p>
     <w:p>
       <w:pPr>
+        <w:keepNext/>
         <w:spacing w:after="110" w:line="274"/>
       </w:pPr>
       <w:r>
@@ -422,7 +429,7 @@
           <w:sz w:val="22"/>
           <w:szCs w:val="22"/>
         </w:rPr>
-        <w:t xml:space="preserve">A)  Solve  </w:t>
+        <w:t xml:space="preserve">A)  </w:t>
       </w:r>
       <w:r>
         <w:rPr>
@@ -452,6 +459,9 @@
         <w:gridCol w:w="9360"/>
       </w:tblGrid>
       <w:tr>
+        <w:trPr>
+          <w:cantSplit/>
+        </w:trPr>
         <w:tc>
           <w:tcPr>
             <w:tcW w:type="dxa" w:w="9360"/>
@@ -580,6 +590,7 @@
     </w:tbl>
     <w:p>
       <w:pPr>
+        <w:keepNext/>
         <w:spacing w:after="110" w:line="274"/>
       </w:pPr>
       <w:r>
@@ -588,7 +599,7 @@
           <w:sz w:val="22"/>
           <w:szCs w:val="22"/>
         </w:rPr>
-        <w:t xml:space="preserve">B)  Solve  </w:t>
+        <w:t xml:space="preserve">B)  </w:t>
       </w:r>
       <w:r>
         <w:rPr>
@@ -618,6 +629,9 @@
         <w:gridCol w:w="9360"/>
       </w:tblGrid>
       <w:tr>
+        <w:trPr>
+          <w:cantSplit/>
+        </w:trPr>
         <w:tc>
           <w:tcPr>
             <w:tcW w:type="dxa" w:w="9360"/>
@@ -746,6 +760,8 @@
     </w:tbl>
     <w:p>
       <w:pPr>
+        <w:keepNext/>
+        <w:pageBreakBefore/>
         <w:spacing w:after="110" w:line="274"/>
       </w:pPr>
       <w:r>
@@ -754,7 +770,7 @@
           <w:sz w:val="22"/>
           <w:szCs w:val="22"/>
         </w:rPr>
-        <w:t xml:space="preserve">C)  Solve  </w:t>
+        <w:t xml:space="preserve">C)  </w:t>
       </w:r>
       <w:r>
         <w:rPr>
@@ -784,6 +800,9 @@
         <w:gridCol w:w="9360"/>
       </w:tblGrid>
       <w:tr>
+        <w:trPr>
+          <w:cantSplit/>
+        </w:trPr>
         <w:tc>
           <w:tcPr>
             <w:tcW w:type="dxa" w:w="9360"/>
@@ -937,7 +956,7 @@
           <w:sz w:val="26"/>
           <w:szCs w:val="26"/>
         </w:rPr>
-        <w:t xml:space="preserve">On your own — stack it and solve</w:t>
+        <w:t xml:space="preserve">On your own</w:t>
       </w:r>
     </w:p>
     <w:tbl>
@@ -957,6 +976,9 @@
         <w:gridCol w:w="4680"/>
       </w:tblGrid>
       <w:tr>
+        <w:trPr>
+          <w:cantSplit/>
+        </w:trPr>
         <w:tc>
           <w:tcPr>
             <w:tcW w:type="dxa" w:w="4680"/>
@@ -1151,6 +1173,9 @@
         </w:tc>
       </w:tr>
       <w:tr>
+        <w:trPr>
+          <w:cantSplit/>
+        </w:trPr>
         <w:tc>
           <w:tcPr>
             <w:tcW w:type="dxa" w:w="4680"/>
@@ -1345,6 +1370,9 @@
         </w:tc>
       </w:tr>
       <w:tr>
+        <w:trPr>
+          <w:cantSplit/>
+        </w:trPr>
         <w:tc>
           <w:tcPr>
             <w:tcW w:type="dxa" w:w="4680"/>
@@ -1555,6 +1583,9 @@
         <w:gridCol w:w="9360"/>
       </w:tblGrid>
       <w:tr>
+        <w:trPr>
+          <w:cantSplit/>
+        </w:trPr>
         <w:tc>
           <w:tcPr>
             <w:tcW w:type="dxa" w:w="9360"/>
@@ -1584,7 +1615,7 @@
                 <w:sz w:val="20"/>
                 <w:szCs w:val="20"/>
               </w:rPr>
-              <w:t xml:space="preserve">Set it up yourself — stack each one, then solve.</w:t>
+              <w:t xml:space="preserve">Stack it, then solve.</w:t>
             </w:r>
           </w:p>
           <w:p>
@@ -1630,7 +1661,7 @@
           <w:sz w:val="20"/>
           <w:szCs w:val="20"/>
         </w:rPr>
-        <w:t xml:space="preserve">Every miss just shows you the line-up. Keep going. ★</w:t>
+        <w:t xml:space="preserve">Keep going. ★</w:t>
       </w:r>
     </w:p>
     <w:sectPr>

</xml_diff>